<commit_message>
Test et fin du TP
</commit_message>
<xml_diff>
--- a/Réponses_partie2.docx
+++ b/Réponses_partie2.docx
@@ -70,7 +70,7 @@
     <w:p>
       <w:pPr>
         <w:rPr>
-          <w:rFonts w:hint="default" w:cs="Times New Roman"/>
+          <w:rFonts w:hint="default" w:ascii="Times New Roman" w:hAnsi="Times New Roman" w:cs="Times New Roman"/>
           <w:b/>
           <w:bCs/>
           <w:sz w:val="23"/>
@@ -90,7 +90,7 @@
       </w:r>
       <w:r>
         <w:rPr>
-          <w:rFonts w:hint="default" w:cs="Times New Roman"/>
+          <w:rFonts w:hint="default" w:ascii="Times New Roman" w:hAnsi="Times New Roman" w:cs="Times New Roman"/>
           <w:b/>
           <w:bCs/>
           <w:sz w:val="23"/>
@@ -103,42 +103,763 @@
     <w:p>
       <w:pPr>
         <w:rPr>
-          <w:rFonts w:hint="default" w:cs="Times New Roman"/>
-          <w:b/>
-          <w:bCs/>
-          <w:sz w:val="23"/>
-          <w:szCs w:val="23"/>
-          <w:lang w:val="fr-FR"/>
-        </w:rPr>
-      </w:pPr>
-    </w:p>
-    <w:p>
-      <w:pPr>
-        <w:rPr>
-          <w:rFonts w:hint="default" w:cs="Times New Roman"/>
-          <w:b/>
-          <w:bCs/>
-          <w:sz w:val="23"/>
-          <w:szCs w:val="23"/>
-          <w:lang w:val="fr-FR"/>
-        </w:rPr>
-      </w:pPr>
-      <w:r>
-        <w:rPr>
-          <w:rFonts w:hint="default" w:cs="Times New Roman"/>
-          <w:b/>
-          <w:bCs/>
-          <w:sz w:val="23"/>
-          <w:szCs w:val="23"/>
-          <w:lang w:val="fr-FR"/>
-        </w:rPr>
-        <w:t>Exercice 1 :</w:t>
-      </w:r>
-    </w:p>
-    <w:p>
-      <w:pPr>
-        <w:rPr>
-          <w:rFonts w:hint="default" w:cs="Times New Roman"/>
+          <w:rFonts w:hint="default" w:ascii="Times New Roman" w:hAnsi="Times New Roman" w:cs="Times New Roman"/>
+          <w:b/>
+          <w:bCs/>
+          <w:sz w:val="23"/>
+          <w:szCs w:val="23"/>
+          <w:lang w:val="fr-FR"/>
+        </w:rPr>
+      </w:pPr>
+    </w:p>
+    <w:p>
+      <w:pPr>
+        <w:rPr>
+          <w:rStyle w:val="4"/>
+          <w:rFonts w:hint="default" w:ascii="Times New Roman" w:hAnsi="Times New Roman" w:eastAsia="SimSun" w:cs="Times New Roman"/>
+          <w:sz w:val="23"/>
+          <w:szCs w:val="23"/>
+        </w:rPr>
+      </w:pPr>
+      <w:r>
+        <w:rPr>
+          <w:rFonts w:hint="default" w:ascii="Times New Roman" w:hAnsi="Times New Roman" w:cs="Times New Roman"/>
+          <w:b/>
+          <w:bCs/>
+          <w:sz w:val="23"/>
+          <w:szCs w:val="23"/>
+          <w:lang w:val="fr-FR"/>
+        </w:rPr>
+        <w:t xml:space="preserve">Exercice 1 : </w:t>
+      </w:r>
+      <w:r>
+        <w:rPr>
+          <w:rFonts w:hint="default" w:ascii="Times New Roman" w:hAnsi="Times New Roman" w:eastAsia="SimSun" w:cs="Times New Roman"/>
+          <w:sz w:val="23"/>
+          <w:szCs w:val="23"/>
+        </w:rPr>
+        <w:t xml:space="preserve">Query </w:t>
+      </w:r>
+      <w:r>
+        <w:rPr>
+          <w:rStyle w:val="4"/>
+          <w:rFonts w:hint="default" w:ascii="Times New Roman" w:hAnsi="Times New Roman" w:eastAsia="SimSun" w:cs="Times New Roman"/>
+          <w:sz w:val="23"/>
+          <w:szCs w:val="23"/>
+        </w:rPr>
+        <w:t>brands</w:t>
+      </w:r>
+    </w:p>
+    <w:p>
+      <w:pPr>
+        <w:rPr>
+          <w:rStyle w:val="4"/>
+          <w:rFonts w:hint="default" w:ascii="Times New Roman" w:hAnsi="Times New Roman" w:eastAsia="SimSun" w:cs="Times New Roman"/>
+          <w:sz w:val="23"/>
+          <w:szCs w:val="23"/>
+          <w:lang w:val="fr-FR"/>
+        </w:rPr>
+      </w:pPr>
+      <w:r>
+        <w:rPr>
+          <w:rStyle w:val="4"/>
+          <w:rFonts w:hint="default" w:ascii="Times New Roman" w:hAnsi="Times New Roman" w:eastAsia="SimSun" w:cs="Times New Roman"/>
+          <w:sz w:val="23"/>
+          <w:szCs w:val="23"/>
+          <w:lang w:val="fr-FR"/>
+        </w:rPr>
+        <w:drawing>
+          <wp:inline distT="0" distB="0" distL="114300" distR="114300">
+            <wp:extent cx="5266690" cy="1016635"/>
+            <wp:effectExtent l="0" t="0" r="3810" b="12065"/>
+            <wp:docPr id="1" name="Image 1" descr="1"/>
+            <wp:cNvGraphicFramePr>
+              <a:graphicFrameLocks xmlns:a="http://schemas.openxmlformats.org/drawingml/2006/main" noChangeAspect="1"/>
+            </wp:cNvGraphicFramePr>
+            <a:graphic xmlns:a="http://schemas.openxmlformats.org/drawingml/2006/main">
+              <a:graphicData uri="http://schemas.openxmlformats.org/drawingml/2006/picture">
+                <pic:pic xmlns:pic="http://schemas.openxmlformats.org/drawingml/2006/picture">
+                  <pic:nvPicPr>
+                    <pic:cNvPr id="1" name="Image 1" descr="1"/>
+                    <pic:cNvPicPr>
+                      <a:picLocks noChangeAspect="1"/>
+                    </pic:cNvPicPr>
+                  </pic:nvPicPr>
+                  <pic:blipFill>
+                    <a:blip r:embed="rId4"/>
+                    <a:stretch>
+                      <a:fillRect/>
+                    </a:stretch>
+                  </pic:blipFill>
+                  <pic:spPr>
+                    <a:xfrm>
+                      <a:off x="0" y="0"/>
+                      <a:ext cx="5266690" cy="1016635"/>
+                    </a:xfrm>
+                    <a:prstGeom prst="rect">
+                      <a:avLst/>
+                    </a:prstGeom>
+                  </pic:spPr>
+                </pic:pic>
+              </a:graphicData>
+            </a:graphic>
+          </wp:inline>
+        </w:drawing>
+      </w:r>
+    </w:p>
+    <w:p>
+      <w:pPr>
+        <w:rPr>
+          <w:rStyle w:val="4"/>
+          <w:rFonts w:hint="default" w:ascii="Times New Roman" w:hAnsi="Times New Roman" w:eastAsia="SimSun" w:cs="Times New Roman"/>
+          <w:sz w:val="23"/>
+          <w:szCs w:val="23"/>
+          <w:lang w:val="fr-FR"/>
+        </w:rPr>
+      </w:pPr>
+    </w:p>
+    <w:p>
+      <w:pPr>
+        <w:rPr>
+          <w:rStyle w:val="4"/>
+          <w:rFonts w:hint="default" w:ascii="Times New Roman" w:hAnsi="Times New Roman" w:eastAsia="SimSun" w:cs="Times New Roman"/>
+          <w:sz w:val="23"/>
+          <w:szCs w:val="23"/>
+          <w:lang w:val="fr-FR"/>
+        </w:rPr>
+      </w:pPr>
+      <w:r>
+        <w:rPr>
+          <w:rStyle w:val="4"/>
+          <w:rFonts w:hint="default" w:ascii="Times New Roman" w:hAnsi="Times New Roman" w:eastAsia="SimSun" w:cs="Times New Roman"/>
+          <w:b/>
+          <w:bCs/>
+          <w:sz w:val="23"/>
+          <w:szCs w:val="23"/>
+          <w:lang w:val="fr-FR"/>
+        </w:rPr>
+        <w:t>Exercice 2 :</w:t>
+      </w:r>
+      <w:r>
+        <w:rPr>
+          <w:rStyle w:val="4"/>
+          <w:rFonts w:hint="default" w:ascii="Times New Roman" w:hAnsi="Times New Roman" w:eastAsia="SimSun" w:cs="Times New Roman"/>
+          <w:sz w:val="23"/>
+          <w:szCs w:val="23"/>
+          <w:lang w:val="fr-FR"/>
+        </w:rPr>
+        <w:t xml:space="preserve"> Query brand(id: ID!)</w:t>
+      </w:r>
+    </w:p>
+    <w:p>
+      <w:pPr>
+        <w:rPr>
+          <w:rStyle w:val="4"/>
+          <w:rFonts w:hint="default" w:ascii="Times New Roman" w:hAnsi="Times New Roman" w:eastAsia="SimSun" w:cs="Times New Roman"/>
+          <w:sz w:val="23"/>
+          <w:szCs w:val="23"/>
+          <w:lang w:val="fr-FR"/>
+        </w:rPr>
+      </w:pPr>
+      <w:r>
+        <w:rPr>
+          <w:rStyle w:val="4"/>
+          <w:rFonts w:hint="default" w:ascii="Times New Roman" w:hAnsi="Times New Roman" w:eastAsia="SimSun" w:cs="Times New Roman"/>
+          <w:sz w:val="23"/>
+          <w:szCs w:val="23"/>
+          <w:lang w:val="fr-FR"/>
+        </w:rPr>
+        <w:drawing>
+          <wp:inline distT="0" distB="0" distL="114300" distR="114300">
+            <wp:extent cx="5273675" cy="1000760"/>
+            <wp:effectExtent l="0" t="0" r="9525" b="2540"/>
+            <wp:docPr id="2" name="Image 2" descr="2"/>
+            <wp:cNvGraphicFramePr>
+              <a:graphicFrameLocks xmlns:a="http://schemas.openxmlformats.org/drawingml/2006/main" noChangeAspect="1"/>
+            </wp:cNvGraphicFramePr>
+            <a:graphic xmlns:a="http://schemas.openxmlformats.org/drawingml/2006/main">
+              <a:graphicData uri="http://schemas.openxmlformats.org/drawingml/2006/picture">
+                <pic:pic xmlns:pic="http://schemas.openxmlformats.org/drawingml/2006/picture">
+                  <pic:nvPicPr>
+                    <pic:cNvPr id="2" name="Image 2" descr="2"/>
+                    <pic:cNvPicPr>
+                      <a:picLocks noChangeAspect="1"/>
+                    </pic:cNvPicPr>
+                  </pic:nvPicPr>
+                  <pic:blipFill>
+                    <a:blip r:embed="rId5"/>
+                    <a:stretch>
+                      <a:fillRect/>
+                    </a:stretch>
+                  </pic:blipFill>
+                  <pic:spPr>
+                    <a:xfrm>
+                      <a:off x="0" y="0"/>
+                      <a:ext cx="5273675" cy="1000760"/>
+                    </a:xfrm>
+                    <a:prstGeom prst="rect">
+                      <a:avLst/>
+                    </a:prstGeom>
+                  </pic:spPr>
+                </pic:pic>
+              </a:graphicData>
+            </a:graphic>
+          </wp:inline>
+        </w:drawing>
+      </w:r>
+    </w:p>
+    <w:p>
+      <w:pPr>
+        <w:rPr>
+          <w:rStyle w:val="4"/>
+          <w:rFonts w:hint="default" w:ascii="Times New Roman" w:hAnsi="Times New Roman" w:eastAsia="SimSun" w:cs="Times New Roman"/>
+          <w:sz w:val="23"/>
+          <w:szCs w:val="23"/>
+          <w:lang w:val="fr-FR"/>
+        </w:rPr>
+      </w:pPr>
+    </w:p>
+    <w:p>
+      <w:pPr>
+        <w:rPr>
+          <w:rStyle w:val="4"/>
+          <w:rFonts w:hint="default" w:ascii="Times New Roman" w:hAnsi="Times New Roman" w:eastAsia="SimSun" w:cs="Times New Roman"/>
+          <w:sz w:val="23"/>
+          <w:szCs w:val="23"/>
+          <w:lang w:val="fr-FR"/>
+        </w:rPr>
+      </w:pPr>
+      <w:r>
+        <w:rPr>
+          <w:rStyle w:val="4"/>
+          <w:rFonts w:hint="default" w:ascii="Times New Roman" w:hAnsi="Times New Roman" w:eastAsia="SimSun" w:cs="Times New Roman"/>
+          <w:b/>
+          <w:bCs/>
+          <w:sz w:val="23"/>
+          <w:szCs w:val="23"/>
+          <w:lang w:val="fr-FR"/>
+        </w:rPr>
+        <w:t>Exercice 3 :</w:t>
+      </w:r>
+      <w:r>
+        <w:rPr>
+          <w:rStyle w:val="4"/>
+          <w:rFonts w:hint="default" w:ascii="Times New Roman" w:hAnsi="Times New Roman" w:eastAsia="SimSun" w:cs="Times New Roman"/>
+          <w:sz w:val="23"/>
+          <w:szCs w:val="23"/>
+          <w:lang w:val="fr-FR"/>
+        </w:rPr>
+        <w:t xml:space="preserve"> Champ Product.brand</w:t>
+      </w:r>
+    </w:p>
+    <w:p>
+      <w:pPr>
+        <w:rPr>
+          <w:rStyle w:val="4"/>
+          <w:rFonts w:hint="default" w:ascii="Times New Roman" w:hAnsi="Times New Roman" w:eastAsia="SimSun" w:cs="Times New Roman"/>
+          <w:sz w:val="23"/>
+          <w:szCs w:val="23"/>
+          <w:lang w:val="fr-FR"/>
+        </w:rPr>
+      </w:pPr>
+      <w:r>
+        <w:rPr>
+          <w:rStyle w:val="4"/>
+          <w:rFonts w:hint="default" w:ascii="Times New Roman" w:hAnsi="Times New Roman" w:eastAsia="SimSun" w:cs="Times New Roman"/>
+          <w:sz w:val="23"/>
+          <w:szCs w:val="23"/>
+          <w:lang w:val="fr-FR"/>
+        </w:rPr>
+        <w:drawing>
+          <wp:inline distT="0" distB="0" distL="114300" distR="114300">
+            <wp:extent cx="5272405" cy="1076325"/>
+            <wp:effectExtent l="0" t="0" r="10795" b="3175"/>
+            <wp:docPr id="3" name="Image 3" descr="3"/>
+            <wp:cNvGraphicFramePr>
+              <a:graphicFrameLocks xmlns:a="http://schemas.openxmlformats.org/drawingml/2006/main" noChangeAspect="1"/>
+            </wp:cNvGraphicFramePr>
+            <a:graphic xmlns:a="http://schemas.openxmlformats.org/drawingml/2006/main">
+              <a:graphicData uri="http://schemas.openxmlformats.org/drawingml/2006/picture">
+                <pic:pic xmlns:pic="http://schemas.openxmlformats.org/drawingml/2006/picture">
+                  <pic:nvPicPr>
+                    <pic:cNvPr id="3" name="Image 3" descr="3"/>
+                    <pic:cNvPicPr>
+                      <a:picLocks noChangeAspect="1"/>
+                    </pic:cNvPicPr>
+                  </pic:nvPicPr>
+                  <pic:blipFill>
+                    <a:blip r:embed="rId6"/>
+                    <a:stretch>
+                      <a:fillRect/>
+                    </a:stretch>
+                  </pic:blipFill>
+                  <pic:spPr>
+                    <a:xfrm>
+                      <a:off x="0" y="0"/>
+                      <a:ext cx="5272405" cy="1076325"/>
+                    </a:xfrm>
+                    <a:prstGeom prst="rect">
+                      <a:avLst/>
+                    </a:prstGeom>
+                  </pic:spPr>
+                </pic:pic>
+              </a:graphicData>
+            </a:graphic>
+          </wp:inline>
+        </w:drawing>
+      </w:r>
+    </w:p>
+    <w:p>
+      <w:pPr>
+        <w:rPr>
+          <w:rStyle w:val="4"/>
+          <w:rFonts w:hint="default" w:ascii="Times New Roman" w:hAnsi="Times New Roman" w:eastAsia="SimSun" w:cs="Times New Roman"/>
+          <w:sz w:val="23"/>
+          <w:szCs w:val="23"/>
+          <w:lang w:val="fr-FR"/>
+        </w:rPr>
+      </w:pPr>
+    </w:p>
+    <w:p>
+      <w:pPr>
+        <w:rPr>
+          <w:rStyle w:val="4"/>
+          <w:rFonts w:hint="default" w:ascii="Times New Roman" w:hAnsi="Times New Roman" w:eastAsia="SimSun" w:cs="Times New Roman"/>
+          <w:sz w:val="23"/>
+          <w:szCs w:val="23"/>
+          <w:lang w:val="fr-FR"/>
+        </w:rPr>
+      </w:pPr>
+      <w:r>
+        <w:rPr>
+          <w:rStyle w:val="4"/>
+          <w:rFonts w:hint="default" w:ascii="Times New Roman" w:hAnsi="Times New Roman" w:eastAsia="SimSun" w:cs="Times New Roman"/>
+          <w:b/>
+          <w:bCs/>
+          <w:sz w:val="23"/>
+          <w:szCs w:val="23"/>
+          <w:lang w:val="fr-FR"/>
+        </w:rPr>
+        <w:t>Exercice 4 :</w:t>
+      </w:r>
+      <w:r>
+        <w:rPr>
+          <w:rStyle w:val="4"/>
+          <w:rFonts w:hint="default" w:ascii="Times New Roman" w:hAnsi="Times New Roman" w:eastAsia="SimSun" w:cs="Times New Roman"/>
+          <w:sz w:val="23"/>
+          <w:szCs w:val="23"/>
+          <w:lang w:val="fr-FR"/>
+        </w:rPr>
+        <w:t xml:space="preserve"> Champ Brand.products</w:t>
+      </w:r>
+    </w:p>
+    <w:p>
+      <w:pPr>
+        <w:rPr>
+          <w:rStyle w:val="4"/>
+          <w:rFonts w:hint="default" w:ascii="Times New Roman" w:hAnsi="Times New Roman" w:eastAsia="SimSun" w:cs="Times New Roman"/>
+          <w:sz w:val="23"/>
+          <w:szCs w:val="23"/>
+          <w:lang w:val="fr-FR"/>
+        </w:rPr>
+      </w:pPr>
+      <w:r>
+        <w:rPr>
+          <w:rStyle w:val="4"/>
+          <w:rFonts w:hint="default" w:ascii="Times New Roman" w:hAnsi="Times New Roman" w:eastAsia="SimSun" w:cs="Times New Roman"/>
+          <w:sz w:val="23"/>
+          <w:szCs w:val="23"/>
+          <w:lang w:val="fr-FR"/>
+        </w:rPr>
+        <w:drawing>
+          <wp:inline distT="0" distB="0" distL="114300" distR="114300">
+            <wp:extent cx="5269230" cy="1037590"/>
+            <wp:effectExtent l="0" t="0" r="1270" b="3810"/>
+            <wp:docPr id="4" name="Image 4" descr="4"/>
+            <wp:cNvGraphicFramePr>
+              <a:graphicFrameLocks xmlns:a="http://schemas.openxmlformats.org/drawingml/2006/main" noChangeAspect="1"/>
+            </wp:cNvGraphicFramePr>
+            <a:graphic xmlns:a="http://schemas.openxmlformats.org/drawingml/2006/main">
+              <a:graphicData uri="http://schemas.openxmlformats.org/drawingml/2006/picture">
+                <pic:pic xmlns:pic="http://schemas.openxmlformats.org/drawingml/2006/picture">
+                  <pic:nvPicPr>
+                    <pic:cNvPr id="4" name="Image 4" descr="4"/>
+                    <pic:cNvPicPr>
+                      <a:picLocks noChangeAspect="1"/>
+                    </pic:cNvPicPr>
+                  </pic:nvPicPr>
+                  <pic:blipFill>
+                    <a:blip r:embed="rId7"/>
+                    <a:stretch>
+                      <a:fillRect/>
+                    </a:stretch>
+                  </pic:blipFill>
+                  <pic:spPr>
+                    <a:xfrm>
+                      <a:off x="0" y="0"/>
+                      <a:ext cx="5269230" cy="1037590"/>
+                    </a:xfrm>
+                    <a:prstGeom prst="rect">
+                      <a:avLst/>
+                    </a:prstGeom>
+                  </pic:spPr>
+                </pic:pic>
+              </a:graphicData>
+            </a:graphic>
+          </wp:inline>
+        </w:drawing>
+      </w:r>
+    </w:p>
+    <w:p>
+      <w:pPr>
+        <w:rPr>
+          <w:rStyle w:val="4"/>
+          <w:rFonts w:hint="default" w:ascii="Times New Roman" w:hAnsi="Times New Roman" w:eastAsia="SimSun" w:cs="Times New Roman"/>
+          <w:sz w:val="23"/>
+          <w:szCs w:val="23"/>
+          <w:lang w:val="fr-FR"/>
+        </w:rPr>
+      </w:pPr>
+    </w:p>
+    <w:p>
+      <w:pPr>
+        <w:rPr>
+          <w:rStyle w:val="4"/>
+          <w:rFonts w:hint="default" w:ascii="Times New Roman" w:hAnsi="Times New Roman" w:eastAsia="SimSun" w:cs="Times New Roman"/>
+          <w:sz w:val="23"/>
+          <w:szCs w:val="23"/>
+          <w:lang w:val="fr-FR"/>
+        </w:rPr>
+      </w:pPr>
+      <w:r>
+        <w:rPr>
+          <w:rStyle w:val="4"/>
+          <w:rFonts w:hint="default" w:ascii="Times New Roman" w:hAnsi="Times New Roman" w:eastAsia="SimSun" w:cs="Times New Roman"/>
+          <w:b/>
+          <w:bCs/>
+          <w:sz w:val="23"/>
+          <w:szCs w:val="23"/>
+          <w:lang w:val="fr-FR"/>
+        </w:rPr>
+        <w:t>Exercice 5 :</w:t>
+      </w:r>
+      <w:r>
+        <w:rPr>
+          <w:rStyle w:val="4"/>
+          <w:rFonts w:hint="default" w:ascii="Times New Roman" w:hAnsi="Times New Roman" w:eastAsia="SimSun" w:cs="Times New Roman"/>
+          <w:sz w:val="23"/>
+          <w:szCs w:val="23"/>
+          <w:lang w:val="fr-FR"/>
+        </w:rPr>
+        <w:t xml:space="preserve"> Champs calculés (Order.total &amp; User.ordersCount)</w:t>
+      </w:r>
+    </w:p>
+    <w:p>
+      <w:pPr>
+        <w:rPr>
+          <w:rStyle w:val="4"/>
+          <w:rFonts w:hint="default" w:ascii="Times New Roman" w:hAnsi="Times New Roman" w:eastAsia="SimSun" w:cs="Times New Roman"/>
+          <w:sz w:val="23"/>
+          <w:szCs w:val="23"/>
+          <w:lang w:val="fr-FR"/>
+        </w:rPr>
+      </w:pPr>
+      <w:r>
+        <w:rPr>
+          <w:rStyle w:val="4"/>
+          <w:rFonts w:hint="default" w:ascii="Times New Roman" w:hAnsi="Times New Roman" w:eastAsia="SimSun" w:cs="Times New Roman"/>
+          <w:sz w:val="23"/>
+          <w:szCs w:val="23"/>
+          <w:lang w:val="fr-FR"/>
+        </w:rPr>
+        <w:drawing>
+          <wp:inline distT="0" distB="0" distL="114300" distR="114300">
+            <wp:extent cx="5269230" cy="1224915"/>
+            <wp:effectExtent l="0" t="0" r="1270" b="6985"/>
+            <wp:docPr id="5" name="Image 5" descr="5"/>
+            <wp:cNvGraphicFramePr>
+              <a:graphicFrameLocks xmlns:a="http://schemas.openxmlformats.org/drawingml/2006/main" noChangeAspect="1"/>
+            </wp:cNvGraphicFramePr>
+            <a:graphic xmlns:a="http://schemas.openxmlformats.org/drawingml/2006/main">
+              <a:graphicData uri="http://schemas.openxmlformats.org/drawingml/2006/picture">
+                <pic:pic xmlns:pic="http://schemas.openxmlformats.org/drawingml/2006/picture">
+                  <pic:nvPicPr>
+                    <pic:cNvPr id="5" name="Image 5" descr="5"/>
+                    <pic:cNvPicPr>
+                      <a:picLocks noChangeAspect="1"/>
+                    </pic:cNvPicPr>
+                  </pic:nvPicPr>
+                  <pic:blipFill>
+                    <a:blip r:embed="rId8"/>
+                    <a:stretch>
+                      <a:fillRect/>
+                    </a:stretch>
+                  </pic:blipFill>
+                  <pic:spPr>
+                    <a:xfrm>
+                      <a:off x="0" y="0"/>
+                      <a:ext cx="5269230" cy="1224915"/>
+                    </a:xfrm>
+                    <a:prstGeom prst="rect">
+                      <a:avLst/>
+                    </a:prstGeom>
+                  </pic:spPr>
+                </pic:pic>
+              </a:graphicData>
+            </a:graphic>
+          </wp:inline>
+        </w:drawing>
+      </w:r>
+    </w:p>
+    <w:p>
+      <w:pPr>
+        <w:rPr>
+          <w:rStyle w:val="4"/>
+          <w:rFonts w:hint="default" w:ascii="Times New Roman" w:hAnsi="Times New Roman" w:eastAsia="SimSun" w:cs="Times New Roman"/>
+          <w:sz w:val="23"/>
+          <w:szCs w:val="23"/>
+          <w:lang w:val="fr-FR"/>
+        </w:rPr>
+      </w:pPr>
+      <w:r>
+        <w:rPr>
+          <w:rStyle w:val="4"/>
+          <w:rFonts w:hint="default" w:ascii="Times New Roman" w:hAnsi="Times New Roman" w:eastAsia="SimSun" w:cs="Times New Roman"/>
+          <w:b/>
+          <w:bCs/>
+          <w:sz w:val="23"/>
+          <w:szCs w:val="23"/>
+          <w:lang w:val="fr-FR"/>
+        </w:rPr>
+        <w:t>Exercice 6 :</w:t>
+      </w:r>
+      <w:r>
+        <w:rPr>
+          <w:rStyle w:val="4"/>
+          <w:rFonts w:hint="default" w:ascii="Times New Roman" w:hAnsi="Times New Roman" w:eastAsia="SimSun" w:cs="Times New Roman"/>
+          <w:sz w:val="23"/>
+          <w:szCs w:val="23"/>
+          <w:lang w:val="fr-FR"/>
+        </w:rPr>
+        <w:t xml:space="preserve"> Filtres products &amp; Mutation createBrand</w:t>
+      </w:r>
+    </w:p>
+    <w:p>
+      <w:pPr>
+        <w:rPr>
+          <w:rStyle w:val="4"/>
+          <w:rFonts w:hint="default" w:ascii="Times New Roman" w:hAnsi="Times New Roman" w:eastAsia="SimSun" w:cs="Times New Roman"/>
+          <w:sz w:val="23"/>
+          <w:szCs w:val="23"/>
+          <w:lang w:val="fr-FR"/>
+        </w:rPr>
+      </w:pPr>
+    </w:p>
+    <w:p>
+      <w:pPr>
+        <w:numPr>
+          <w:ilvl w:val="0"/>
+          <w:numId w:val="1"/>
+        </w:numPr>
+        <w:ind w:left="425" w:leftChars="0" w:hanging="425" w:firstLineChars="0"/>
+        <w:rPr>
+          <w:rStyle w:val="4"/>
+          <w:rFonts w:hint="default" w:ascii="Times New Roman" w:hAnsi="Times New Roman" w:eastAsia="SimSun" w:cs="Times New Roman"/>
+          <w:sz w:val="23"/>
+          <w:szCs w:val="23"/>
+          <w:lang w:val="fr-FR"/>
+        </w:rPr>
+      </w:pPr>
+      <w:r>
+        <w:rPr>
+          <w:rStyle w:val="4"/>
+          <w:rFonts w:hint="default" w:ascii="Times New Roman" w:hAnsi="Times New Roman" w:cs="Times New Roman"/>
+          <w:sz w:val="23"/>
+          <w:szCs w:val="23"/>
+          <w:lang w:val="fr-FR"/>
+        </w:rPr>
+        <w:t>Test des filtres</w:t>
+      </w:r>
+    </w:p>
+    <w:p>
+      <w:pPr>
+        <w:numPr>
+          <w:numId w:val="0"/>
+        </w:numPr>
+        <w:ind w:leftChars="0"/>
+        <w:rPr>
+          <w:rStyle w:val="4"/>
+          <w:rFonts w:hint="default" w:ascii="Times New Roman" w:hAnsi="Times New Roman" w:eastAsia="SimSun" w:cs="Times New Roman"/>
+          <w:sz w:val="23"/>
+          <w:szCs w:val="23"/>
+          <w:lang w:val="fr-FR"/>
+        </w:rPr>
+      </w:pPr>
+      <w:r>
+        <w:rPr>
+          <w:rStyle w:val="4"/>
+          <w:rFonts w:hint="default" w:ascii="Times New Roman" w:hAnsi="Times New Roman" w:eastAsia="SimSun" w:cs="Times New Roman"/>
+          <w:sz w:val="23"/>
+          <w:szCs w:val="23"/>
+          <w:lang w:val="fr-FR"/>
+        </w:rPr>
+        <w:drawing>
+          <wp:inline distT="0" distB="0" distL="114300" distR="114300">
+            <wp:extent cx="5269230" cy="729615"/>
+            <wp:effectExtent l="0" t="0" r="1270" b="6985"/>
+            <wp:docPr id="6" name="Image 6" descr="6"/>
+            <wp:cNvGraphicFramePr>
+              <a:graphicFrameLocks xmlns:a="http://schemas.openxmlformats.org/drawingml/2006/main" noChangeAspect="1"/>
+            </wp:cNvGraphicFramePr>
+            <a:graphic xmlns:a="http://schemas.openxmlformats.org/drawingml/2006/main">
+              <a:graphicData uri="http://schemas.openxmlformats.org/drawingml/2006/picture">
+                <pic:pic xmlns:pic="http://schemas.openxmlformats.org/drawingml/2006/picture">
+                  <pic:nvPicPr>
+                    <pic:cNvPr id="6" name="Image 6" descr="6"/>
+                    <pic:cNvPicPr>
+                      <a:picLocks noChangeAspect="1"/>
+                    </pic:cNvPicPr>
+                  </pic:nvPicPr>
+                  <pic:blipFill>
+                    <a:blip r:embed="rId9"/>
+                    <a:stretch>
+                      <a:fillRect/>
+                    </a:stretch>
+                  </pic:blipFill>
+                  <pic:spPr>
+                    <a:xfrm>
+                      <a:off x="0" y="0"/>
+                      <a:ext cx="5269230" cy="729615"/>
+                    </a:xfrm>
+                    <a:prstGeom prst="rect">
+                      <a:avLst/>
+                    </a:prstGeom>
+                  </pic:spPr>
+                </pic:pic>
+              </a:graphicData>
+            </a:graphic>
+          </wp:inline>
+        </w:drawing>
+      </w:r>
+    </w:p>
+    <w:p>
+      <w:pPr>
+        <w:numPr>
+          <w:numId w:val="0"/>
+        </w:numPr>
+        <w:ind w:leftChars="0"/>
+        <w:rPr>
+          <w:rStyle w:val="4"/>
+          <w:rFonts w:hint="default" w:ascii="Times New Roman" w:hAnsi="Times New Roman" w:eastAsia="SimSun" w:cs="Times New Roman"/>
+          <w:sz w:val="23"/>
+          <w:szCs w:val="23"/>
+          <w:lang w:val="fr-FR"/>
+        </w:rPr>
+      </w:pPr>
+    </w:p>
+    <w:p>
+      <w:pPr>
+        <w:numPr>
+          <w:ilvl w:val="0"/>
+          <w:numId w:val="1"/>
+        </w:numPr>
+        <w:ind w:left="425" w:leftChars="0" w:hanging="425" w:firstLineChars="0"/>
+        <w:rPr>
+          <w:rStyle w:val="4"/>
+          <w:rFonts w:hint="default" w:ascii="Times New Roman" w:hAnsi="Times New Roman" w:eastAsia="SimSun" w:cs="Times New Roman"/>
+          <w:sz w:val="23"/>
+          <w:szCs w:val="23"/>
+          <w:lang w:val="fr-FR"/>
+        </w:rPr>
+      </w:pPr>
+      <w:r>
+        <w:rPr>
+          <w:rStyle w:val="4"/>
+          <w:rFonts w:hint="default" w:ascii="Times New Roman" w:hAnsi="Times New Roman" w:cs="Times New Roman"/>
+          <w:sz w:val="23"/>
+          <w:szCs w:val="23"/>
+          <w:lang w:val="fr-FR"/>
+        </w:rPr>
+        <w:t>Test des mutations</w:t>
+      </w:r>
+    </w:p>
+    <w:p>
+      <w:pPr>
+        <w:numPr>
+          <w:numId w:val="0"/>
+        </w:numPr>
+        <w:ind w:leftChars="0"/>
+        <w:rPr>
+          <w:rStyle w:val="4"/>
+          <w:rFonts w:hint="default" w:ascii="Times New Roman" w:hAnsi="Times New Roman" w:eastAsia="SimSun" w:cs="Times New Roman"/>
+          <w:sz w:val="23"/>
+          <w:szCs w:val="23"/>
+          <w:lang w:val="fr-FR"/>
+        </w:rPr>
+      </w:pPr>
+      <w:r>
+        <w:rPr>
+          <w:rStyle w:val="4"/>
+          <w:rFonts w:hint="default" w:ascii="Times New Roman" w:hAnsi="Times New Roman" w:eastAsia="SimSun" w:cs="Times New Roman"/>
+          <w:sz w:val="23"/>
+          <w:szCs w:val="23"/>
+          <w:lang w:val="fr-FR"/>
+        </w:rPr>
+        <w:drawing>
+          <wp:inline distT="0" distB="0" distL="114300" distR="114300">
+            <wp:extent cx="5274310" cy="728345"/>
+            <wp:effectExtent l="0" t="0" r="8890" b="8255"/>
+            <wp:docPr id="7" name="Image 7" descr="7"/>
+            <wp:cNvGraphicFramePr>
+              <a:graphicFrameLocks xmlns:a="http://schemas.openxmlformats.org/drawingml/2006/main" noChangeAspect="1"/>
+            </wp:cNvGraphicFramePr>
+            <a:graphic xmlns:a="http://schemas.openxmlformats.org/drawingml/2006/main">
+              <a:graphicData uri="http://schemas.openxmlformats.org/drawingml/2006/picture">
+                <pic:pic xmlns:pic="http://schemas.openxmlformats.org/drawingml/2006/picture">
+                  <pic:nvPicPr>
+                    <pic:cNvPr id="7" name="Image 7" descr="7"/>
+                    <pic:cNvPicPr>
+                      <a:picLocks noChangeAspect="1"/>
+                    </pic:cNvPicPr>
+                  </pic:nvPicPr>
+                  <pic:blipFill>
+                    <a:blip r:embed="rId10"/>
+                    <a:stretch>
+                      <a:fillRect/>
+                    </a:stretch>
+                  </pic:blipFill>
+                  <pic:spPr>
+                    <a:xfrm>
+                      <a:off x="0" y="0"/>
+                      <a:ext cx="5274310" cy="728345"/>
+                    </a:xfrm>
+                    <a:prstGeom prst="rect">
+                      <a:avLst/>
+                    </a:prstGeom>
+                  </pic:spPr>
+                </pic:pic>
+              </a:graphicData>
+            </a:graphic>
+          </wp:inline>
+        </w:drawing>
+      </w:r>
+    </w:p>
+    <w:p>
+      <w:pPr>
+        <w:rPr>
+          <w:rFonts w:hint="default" w:ascii="Times New Roman" w:hAnsi="Times New Roman" w:cs="Times New Roman"/>
+          <w:b/>
+          <w:bCs/>
+          <w:sz w:val="23"/>
+          <w:szCs w:val="23"/>
+          <w:lang w:val="fr-FR"/>
+        </w:rPr>
+      </w:pPr>
+    </w:p>
+    <w:p>
+      <w:pPr>
+        <w:rPr>
+          <w:rFonts w:hint="default" w:ascii="Times New Roman" w:hAnsi="Times New Roman" w:cs="Times New Roman"/>
           <w:b w:val="0"/>
           <w:bCs w:val="0"/>
           <w:sz w:val="23"/>
@@ -146,22 +867,346 @@
           <w:lang w:val="fr-FR"/>
         </w:rPr>
       </w:pPr>
+      <w:r>
+        <w:rPr>
+          <w:rFonts w:hint="default" w:ascii="Times New Roman" w:hAnsi="Times New Roman" w:cs="Times New Roman"/>
+          <w:b/>
+          <w:bCs/>
+          <w:sz w:val="23"/>
+          <w:szCs w:val="23"/>
+          <w:lang w:val="fr-FR"/>
+        </w:rPr>
+        <w:t>Exercice 7 :</w:t>
+      </w:r>
+      <w:r>
+        <w:rPr>
+          <w:rFonts w:hint="default" w:ascii="Times New Roman" w:hAnsi="Times New Roman" w:cs="Times New Roman"/>
+          <w:b w:val="0"/>
+          <w:bCs w:val="0"/>
+          <w:sz w:val="23"/>
+          <w:szCs w:val="23"/>
+          <w:lang w:val="fr-FR"/>
+        </w:rPr>
+        <w:t xml:space="preserve"> Entreprise &amp; Stocks (warehouses, stockByWarehouse, restockProduct)</w:t>
+      </w:r>
+    </w:p>
+    <w:p>
+      <w:pPr>
+        <w:pStyle w:val="5"/>
+        <w:keepNext w:val="0"/>
+        <w:keepLines w:val="0"/>
+        <w:widowControl/>
+        <w:numPr>
+          <w:ilvl w:val="0"/>
+          <w:numId w:val="2"/>
+        </w:numPr>
+        <w:suppressLineNumbers w:val="0"/>
+        <w:ind w:left="425" w:leftChars="0" w:hanging="425" w:firstLineChars="0"/>
+        <w:rPr>
+          <w:rFonts w:hint="default" w:ascii="Times New Roman" w:hAnsi="Times New Roman" w:cs="Times New Roman"/>
+        </w:rPr>
+      </w:pPr>
+      <w:r>
+        <w:rPr>
+          <w:rFonts w:hint="default" w:ascii="Times New Roman" w:hAnsi="Times New Roman" w:cs="Times New Roman"/>
+          <w:b/>
+          <w:bCs/>
+        </w:rPr>
+        <w:t>Test de lecture (</w:t>
+      </w:r>
+      <w:r>
+        <w:rPr>
+          <w:rStyle w:val="4"/>
+          <w:rFonts w:hint="default" w:ascii="Times New Roman" w:hAnsi="Times New Roman" w:cs="Times New Roman"/>
+          <w:b/>
+          <w:bCs/>
+        </w:rPr>
+        <w:t>warehouses</w:t>
+      </w:r>
+      <w:r>
+        <w:rPr>
+          <w:rFonts w:hint="default" w:ascii="Times New Roman" w:hAnsi="Times New Roman" w:cs="Times New Roman"/>
+          <w:b/>
+          <w:bCs/>
+        </w:rPr>
+        <w:t xml:space="preserve"> &amp; </w:t>
+      </w:r>
+      <w:r>
+        <w:rPr>
+          <w:rStyle w:val="4"/>
+          <w:rFonts w:hint="default" w:ascii="Times New Roman" w:hAnsi="Times New Roman" w:cs="Times New Roman"/>
+          <w:b/>
+          <w:bCs/>
+        </w:rPr>
+        <w:t>stockByWarehouse</w:t>
+      </w:r>
+      <w:r>
+        <w:rPr>
+          <w:rFonts w:hint="default" w:ascii="Times New Roman" w:hAnsi="Times New Roman" w:cs="Times New Roman"/>
+          <w:b/>
+          <w:bCs/>
+        </w:rPr>
+        <w:t>) :</w:t>
+      </w:r>
+    </w:p>
+    <w:p>
+      <w:pPr>
+        <w:pStyle w:val="5"/>
+        <w:keepNext w:val="0"/>
+        <w:keepLines w:val="0"/>
+        <w:widowControl/>
+        <w:numPr>
+          <w:numId w:val="0"/>
+        </w:numPr>
+        <w:suppressLineNumbers w:val="0"/>
+        <w:ind w:leftChars="0" w:right="0" w:rightChars="0"/>
+        <w:rPr>
+          <w:rFonts w:hint="default" w:ascii="Times New Roman" w:hAnsi="Times New Roman" w:cs="Times New Roman"/>
+          <w:lang w:val="fr-FR"/>
+        </w:rPr>
+      </w:pPr>
+      <w:r>
+        <w:rPr>
+          <w:rFonts w:hint="default" w:ascii="Times New Roman" w:hAnsi="Times New Roman" w:cs="Times New Roman"/>
+          <w:lang w:val="fr-FR"/>
+        </w:rPr>
+        <w:drawing>
+          <wp:inline distT="0" distB="0" distL="114300" distR="114300">
+            <wp:extent cx="5266055" cy="1518285"/>
+            <wp:effectExtent l="0" t="0" r="4445" b="5715"/>
+            <wp:docPr id="9" name="Image 9" descr="8"/>
+            <wp:cNvGraphicFramePr>
+              <a:graphicFrameLocks xmlns:a="http://schemas.openxmlformats.org/drawingml/2006/main" noChangeAspect="1"/>
+            </wp:cNvGraphicFramePr>
+            <a:graphic xmlns:a="http://schemas.openxmlformats.org/drawingml/2006/main">
+              <a:graphicData uri="http://schemas.openxmlformats.org/drawingml/2006/picture">
+                <pic:pic xmlns:pic="http://schemas.openxmlformats.org/drawingml/2006/picture">
+                  <pic:nvPicPr>
+                    <pic:cNvPr id="9" name="Image 9" descr="8"/>
+                    <pic:cNvPicPr>
+                      <a:picLocks noChangeAspect="1"/>
+                    </pic:cNvPicPr>
+                  </pic:nvPicPr>
+                  <pic:blipFill>
+                    <a:blip r:embed="rId11"/>
+                    <a:stretch>
+                      <a:fillRect/>
+                    </a:stretch>
+                  </pic:blipFill>
+                  <pic:spPr>
+                    <a:xfrm>
+                      <a:off x="0" y="0"/>
+                      <a:ext cx="5266055" cy="1518285"/>
+                    </a:xfrm>
+                    <a:prstGeom prst="rect">
+                      <a:avLst/>
+                    </a:prstGeom>
+                  </pic:spPr>
+                </pic:pic>
+              </a:graphicData>
+            </a:graphic>
+          </wp:inline>
+        </w:drawing>
+      </w:r>
+      <w:r>
+        <w:rPr>
+          <w:rFonts w:hint="default" w:ascii="Times New Roman" w:hAnsi="Times New Roman" w:cs="Times New Roman"/>
+          <w:lang w:val="fr-FR"/>
+        </w:rPr>
+        <w:drawing>
+          <wp:inline distT="0" distB="0" distL="114300" distR="114300">
+            <wp:extent cx="5272405" cy="2036445"/>
+            <wp:effectExtent l="0" t="0" r="10795" b="8255"/>
+            <wp:docPr id="8" name="Image 8" descr="9"/>
+            <wp:cNvGraphicFramePr>
+              <a:graphicFrameLocks xmlns:a="http://schemas.openxmlformats.org/drawingml/2006/main" noChangeAspect="1"/>
+            </wp:cNvGraphicFramePr>
+            <a:graphic xmlns:a="http://schemas.openxmlformats.org/drawingml/2006/main">
+              <a:graphicData uri="http://schemas.openxmlformats.org/drawingml/2006/picture">
+                <pic:pic xmlns:pic="http://schemas.openxmlformats.org/drawingml/2006/picture">
+                  <pic:nvPicPr>
+                    <pic:cNvPr id="8" name="Image 8" descr="9"/>
+                    <pic:cNvPicPr>
+                      <a:picLocks noChangeAspect="1"/>
+                    </pic:cNvPicPr>
+                  </pic:nvPicPr>
+                  <pic:blipFill>
+                    <a:blip r:embed="rId12"/>
+                    <a:stretch>
+                      <a:fillRect/>
+                    </a:stretch>
+                  </pic:blipFill>
+                  <pic:spPr>
+                    <a:xfrm>
+                      <a:off x="0" y="0"/>
+                      <a:ext cx="5272405" cy="2036445"/>
+                    </a:xfrm>
+                    <a:prstGeom prst="rect">
+                      <a:avLst/>
+                    </a:prstGeom>
+                  </pic:spPr>
+                </pic:pic>
+              </a:graphicData>
+            </a:graphic>
+          </wp:inline>
+        </w:drawing>
+      </w:r>
+    </w:p>
+    <w:p>
+      <w:pPr>
+        <w:pStyle w:val="5"/>
+        <w:keepNext w:val="0"/>
+        <w:keepLines w:val="0"/>
+        <w:widowControl/>
+        <w:numPr>
+          <w:numId w:val="0"/>
+        </w:numPr>
+        <w:suppressLineNumbers w:val="0"/>
+        <w:ind w:leftChars="0" w:right="0" w:rightChars="0"/>
+        <w:rPr>
+          <w:rFonts w:hint="default" w:ascii="Times New Roman" w:hAnsi="Times New Roman" w:cs="Times New Roman"/>
+          <w:lang w:val="fr-FR"/>
+        </w:rPr>
+      </w:pPr>
+    </w:p>
+    <w:p>
+      <w:pPr>
+        <w:pStyle w:val="5"/>
+        <w:keepNext w:val="0"/>
+        <w:keepLines w:val="0"/>
+        <w:widowControl/>
+        <w:numPr>
+          <w:ilvl w:val="0"/>
+          <w:numId w:val="2"/>
+        </w:numPr>
+        <w:suppressLineNumbers w:val="0"/>
+        <w:ind w:left="425" w:leftChars="0" w:hanging="425" w:firstLineChars="0"/>
+        <w:rPr>
+          <w:rFonts w:hint="default" w:ascii="Times New Roman" w:hAnsi="Times New Roman" w:cs="Times New Roman"/>
+          <w:lang w:val="fr-FR"/>
+        </w:rPr>
+      </w:pPr>
+      <w:r>
+        <w:rPr>
+          <w:rFonts w:hint="default" w:ascii="Times New Roman" w:hAnsi="Times New Roman" w:cs="Times New Roman"/>
+          <w:b/>
+          <w:bCs/>
+        </w:rPr>
+        <w:t xml:space="preserve">Test de la mutation </w:t>
+      </w:r>
+      <w:r>
+        <w:rPr>
+          <w:rStyle w:val="4"/>
+          <w:rFonts w:hint="default" w:ascii="Times New Roman" w:hAnsi="Times New Roman" w:cs="Times New Roman"/>
+          <w:b/>
+          <w:bCs/>
+        </w:rPr>
+        <w:t>restockProduct</w:t>
+      </w:r>
+      <w:r>
+        <w:rPr>
+          <w:rFonts w:hint="default" w:ascii="Times New Roman" w:hAnsi="Times New Roman" w:cs="Times New Roman"/>
+          <w:b/>
+          <w:bCs/>
+        </w:rPr>
+        <w:t xml:space="preserve"> :</w:t>
+      </w:r>
+    </w:p>
+    <w:p>
+      <w:pPr>
+        <w:pStyle w:val="5"/>
+        <w:keepNext w:val="0"/>
+        <w:keepLines w:val="0"/>
+        <w:widowControl/>
+        <w:numPr>
+          <w:numId w:val="0"/>
+        </w:numPr>
+        <w:suppressLineNumbers w:val="0"/>
+        <w:ind w:leftChars="0" w:right="0" w:rightChars="0"/>
+        <w:rPr>
+          <w:rFonts w:hint="default" w:ascii="Times New Roman" w:hAnsi="Times New Roman" w:cs="Times New Roman"/>
+          <w:lang w:val="fr-FR"/>
+        </w:rPr>
+      </w:pPr>
       <w:bookmarkStart w:id="0" w:name="_GoBack"/>
+      <w:r>
+        <w:rPr>
+          <w:rFonts w:hint="default" w:ascii="Times New Roman" w:hAnsi="Times New Roman" w:cs="Times New Roman"/>
+          <w:lang w:val="fr-FR"/>
+        </w:rPr>
+        <w:drawing>
+          <wp:inline distT="0" distB="0" distL="114300" distR="114300">
+            <wp:extent cx="5266055" cy="1245235"/>
+            <wp:effectExtent l="0" t="0" r="4445" b="12065"/>
+            <wp:docPr id="10" name="Image 10" descr="10"/>
+            <wp:cNvGraphicFramePr>
+              <a:graphicFrameLocks xmlns:a="http://schemas.openxmlformats.org/drawingml/2006/main" noChangeAspect="1"/>
+            </wp:cNvGraphicFramePr>
+            <a:graphic xmlns:a="http://schemas.openxmlformats.org/drawingml/2006/main">
+              <a:graphicData uri="http://schemas.openxmlformats.org/drawingml/2006/picture">
+                <pic:pic xmlns:pic="http://schemas.openxmlformats.org/drawingml/2006/picture">
+                  <pic:nvPicPr>
+                    <pic:cNvPr id="10" name="Image 10" descr="10"/>
+                    <pic:cNvPicPr>
+                      <a:picLocks noChangeAspect="1"/>
+                    </pic:cNvPicPr>
+                  </pic:nvPicPr>
+                  <pic:blipFill>
+                    <a:blip r:embed="rId13"/>
+                    <a:stretch>
+                      <a:fillRect/>
+                    </a:stretch>
+                  </pic:blipFill>
+                  <pic:spPr>
+                    <a:xfrm>
+                      <a:off x="0" y="0"/>
+                      <a:ext cx="5266055" cy="1245235"/>
+                    </a:xfrm>
+                    <a:prstGeom prst="rect">
+                      <a:avLst/>
+                    </a:prstGeom>
+                  </pic:spPr>
+                </pic:pic>
+              </a:graphicData>
+            </a:graphic>
+          </wp:inline>
+        </w:drawing>
+      </w:r>
       <w:bookmarkEnd w:id="0"/>
     </w:p>
     <w:p>
       <w:pPr>
         <w:rPr>
-          <w:rFonts w:hint="default" w:cs="Times New Roman"/>
-          <w:b/>
-          <w:bCs/>
-          <w:sz w:val="23"/>
-          <w:szCs w:val="23"/>
-          <w:lang w:val="fr-FR"/>
-        </w:rPr>
-      </w:pPr>
-    </w:p>
-    <w:p/>
+          <w:rFonts w:hint="default" w:ascii="Times New Roman" w:hAnsi="Times New Roman" w:cs="Times New Roman"/>
+          <w:b w:val="0"/>
+          <w:bCs w:val="0"/>
+          <w:sz w:val="23"/>
+          <w:szCs w:val="23"/>
+          <w:lang w:val="fr-FR"/>
+        </w:rPr>
+      </w:pPr>
+    </w:p>
+    <w:p>
+      <w:pPr>
+        <w:rPr>
+          <w:rFonts w:hint="default" w:ascii="Times New Roman" w:hAnsi="Times New Roman" w:cs="Times New Roman"/>
+          <w:b/>
+          <w:bCs/>
+          <w:sz w:val="23"/>
+          <w:szCs w:val="23"/>
+          <w:lang w:val="fr-FR"/>
+        </w:rPr>
+      </w:pPr>
+    </w:p>
+    <w:p>
+      <w:pPr>
+        <w:rPr>
+          <w:rFonts w:hint="default" w:ascii="Times New Roman" w:hAnsi="Times New Roman" w:cs="Times New Roman"/>
+          <w:sz w:val="23"/>
+          <w:szCs w:val="23"/>
+        </w:rPr>
+      </w:pPr>
+    </w:p>
     <w:sectPr>
       <w:pgSz w:w="11906" w:h="16838"/>
       <w:pgMar w:top="1440" w:right="1800" w:bottom="1440" w:left="1800" w:header="851" w:footer="992" w:gutter="0"/>
@@ -172,18 +1217,69 @@
 </w:document>
 </file>
 
+<file path=word/numbering.xml><?xml version="1.0" encoding="utf-8"?>
+<w:numbering xmlns:wpc="http://schemas.microsoft.com/office/word/2010/wordprocessingCanvas" xmlns:mc="http://schemas.openxmlformats.org/markup-compatibility/2006" xmlns:o="urn:schemas-microsoft-com:office:office" xmlns:r="http://schemas.openxmlformats.org/officeDocument/2006/relationships" xmlns:m="http://schemas.openxmlformats.org/officeDocument/2006/math" xmlns:v="urn:schemas-microsoft-com:vml" xmlns:wp14="http://schemas.microsoft.com/office/word/2010/wordprocessingDrawing" xmlns:wp="http://schemas.openxmlformats.org/drawingml/2006/wordprocessingDrawing" xmlns:w10="urn:schemas-microsoft-com:office:word" xmlns:w="http://schemas.openxmlformats.org/wordprocessingml/2006/main" xmlns:w14="http://schemas.microsoft.com/office/word/2010/wordml" xmlns:wpg="http://schemas.microsoft.com/office/word/2010/wordprocessingGroup" xmlns:wpi="http://schemas.microsoft.com/office/word/2010/wordprocessingInk" xmlns:wne="http://schemas.microsoft.com/office/word/2006/wordml" xmlns:wps="http://schemas.microsoft.com/office/word/2010/wordprocessingShape" xmlns:wpsCustomData="http://www.wps.cn/officeDocument/2013/wpsCustomData" mc:Ignorable="w14 wp14">
+  <w:abstractNum w:abstractNumId="0">
+    <w:nsid w:val="1F0B393D"/>
+    <w:multiLevelType w:val="singleLevel"/>
+    <w:tmpl w:val="1F0B393D"/>
+    <w:lvl w:ilvl="0" w:tentative="0">
+      <w:start w:val="1"/>
+      <w:numFmt w:val="decimal"/>
+      <w:lvlText w:val="%1."/>
+      <w:lvlJc w:val="left"/>
+      <w:pPr>
+        <w:tabs>
+          <w:tab w:val="left" w:pos="425"/>
+        </w:tabs>
+        <w:ind w:left="425" w:leftChars="0" w:hanging="425" w:firstLineChars="0"/>
+      </w:pPr>
+      <w:rPr>
+        <w:rFonts w:hint="default"/>
+      </w:rPr>
+    </w:lvl>
+  </w:abstractNum>
+  <w:abstractNum w:abstractNumId="1">
+    <w:nsid w:val="3CB7887C"/>
+    <w:multiLevelType w:val="singleLevel"/>
+    <w:tmpl w:val="3CB7887C"/>
+    <w:lvl w:ilvl="0" w:tentative="0">
+      <w:start w:val="1"/>
+      <w:numFmt w:val="decimal"/>
+      <w:lvlText w:val="%1."/>
+      <w:lvlJc w:val="left"/>
+      <w:pPr>
+        <w:tabs>
+          <w:tab w:val="left" w:pos="425"/>
+        </w:tabs>
+        <w:ind w:left="425" w:leftChars="0" w:hanging="425" w:firstLineChars="0"/>
+      </w:pPr>
+      <w:rPr>
+        <w:rFonts w:hint="default"/>
+      </w:rPr>
+    </w:lvl>
+  </w:abstractNum>
+  <w:num w:numId="1">
+    <w:abstractNumId w:val="1"/>
+  </w:num>
+  <w:num w:numId="2">
+    <w:abstractNumId w:val="0"/>
+  </w:num>
+</w:numbering>
+</file>
+
 <file path=word/styles.xml><?xml version="1.0" encoding="utf-8"?>
 <w:styles xmlns:mc="http://schemas.openxmlformats.org/markup-compatibility/2006" xmlns:o="urn:schemas-microsoft-com:office:office" xmlns:r="http://schemas.openxmlformats.org/officeDocument/2006/relationships" xmlns:m="http://schemas.openxmlformats.org/officeDocument/2006/math" xmlns:v="urn:schemas-microsoft-com:vml" xmlns:w="http://schemas.openxmlformats.org/wordprocessingml/2006/main" xmlns:w14="http://schemas.microsoft.com/office/word/2010/wordml" xmlns:w10="urn:schemas-microsoft-com:office:word" xmlns:sl="http://schemas.openxmlformats.org/schemaLibrary/2006/main" xmlns:wpsCustomData="http://www.wps.cn/officeDocument/2013/wpsCustomData" mc:Ignorable="w14">
   <w:docDefaults>
     <w:rPrDefault>
       <w:rPr>
-        <w:rFonts w:asciiTheme="minorHAnsi" w:hAnsiTheme="minorHAnsi" w:eastAsiaTheme="minorEastAsia" w:cstheme="minorBidi"/>
+        <w:rFonts w:ascii="Times New Roman" w:hAnsi="Times New Roman" w:eastAsia="SimSun" w:cs="Times New Roman"/>
       </w:rPr>
     </w:rPrDefault>
     <w:pPrDefault/>
   </w:docDefaults>
   <w:latentStyles w:count="260" w:defQFormat="0" w:defUnhideWhenUsed="1" w:defSemiHidden="1" w:defUIPriority="99" w:defLockedState="0">
-    <w:lsdException w:unhideWhenUsed="0" w:uiPriority="0" w:semiHidden="0" w:name="Normal"/>
+    <w:lsdException w:qFormat="1" w:unhideWhenUsed="0" w:uiPriority="0" w:semiHidden="0" w:name="Normal"/>
     <w:lsdException w:qFormat="1" w:unhideWhenUsed="0" w:uiPriority="0" w:semiHidden="0" w:name="heading 1"/>
     <w:lsdException w:qFormat="1" w:uiPriority="0" w:name="heading 2"/>
     <w:lsdException w:qFormat="1" w:uiPriority="0" w:name="heading 3"/>
@@ -286,12 +1382,13 @@
     <w:lsdException w:unhideWhenUsed="0" w:uiPriority="0" w:semiHidden="0" w:name="HTML Sample"/>
     <w:lsdException w:unhideWhenUsed="0" w:uiPriority="0" w:semiHidden="0" w:name="HTML Typewriter"/>
     <w:lsdException w:unhideWhenUsed="0" w:uiPriority="0" w:semiHidden="0" w:name="HTML Variable"/>
-    <w:lsdException w:unhideWhenUsed="0" w:uiPriority="0" w:name="Normal Table"/>
+    <w:lsdException w:qFormat="1" w:unhideWhenUsed="0" w:uiPriority="0" w:name="Normal Table"/>
     <w:lsdException w:unhideWhenUsed="0" w:uiPriority="0" w:semiHidden="0" w:name="annotation subject"/>
     <w:lsdException w:unhideWhenUsed="0" w:uiPriority="0" w:semiHidden="0" w:name="Balloon Text"/>
   </w:latentStyles>
   <w:style w:type="paragraph" w:default="1" w:styleId="1">
     <w:name w:val="Normal"/>
+    <w:qFormat/>
     <w:uiPriority w:val="0"/>
     <w:pPr>
       <w:jc w:val="both"/>
@@ -302,14 +1399,36 @@
       <w:sz w:val="21"/>
     </w:rPr>
   </w:style>
-  <w:style w:type="character" w:default="1" w:styleId="2">
+  <w:style w:type="paragraph" w:styleId="2">
+    <w:name w:val="heading 3"/>
+    <w:next w:val="1"/>
+    <w:semiHidden/>
+    <w:unhideWhenUsed/>
+    <w:qFormat/>
+    <w:uiPriority w:val="0"/>
+    <w:pPr>
+      <w:spacing w:before="0" w:beforeAutospacing="1" w:after="0" w:afterAutospacing="1"/>
+      <w:jc w:val="left"/>
+    </w:pPr>
+    <w:rPr>
+      <w:rFonts w:hint="eastAsia" w:ascii="SimSun" w:hAnsi="SimSun" w:eastAsia="SimSun" w:cs="SimSun"/>
+      <w:b/>
+      <w:bCs/>
+      <w:kern w:val="0"/>
+      <w:sz w:val="26"/>
+      <w:szCs w:val="26"/>
+      <w:lang w:val="en-US" w:eastAsia="zh-CN" w:bidi="ar"/>
+    </w:rPr>
+  </w:style>
+  <w:style w:type="character" w:default="1" w:styleId="3">
     <w:name w:val="Default Paragraph Font"/>
     <w:semiHidden/>
     <w:uiPriority w:val="0"/>
   </w:style>
-  <w:style w:type="table" w:default="1" w:styleId="3">
+  <w:style w:type="table" w:default="1" w:styleId="6">
     <w:name w:val="Normal Table"/>
     <w:semiHidden/>
+    <w:qFormat/>
     <w:uiPriority w:val="0"/>
     <w:tblPr>
       <w:tblCellMar>
@@ -319,6 +1438,30 @@
         <w:right w:w="108" w:type="dxa"/>
       </w:tblCellMar>
     </w:tblPr>
+  </w:style>
+  <w:style w:type="character" w:styleId="4">
+    <w:name w:val="HTML Code"/>
+    <w:uiPriority w:val="0"/>
+    <w:rPr>
+      <w:rFonts w:ascii="Courier New" w:hAnsi="Courier New" w:cs="Courier New"/>
+      <w:sz w:val="20"/>
+      <w:szCs w:val="20"/>
+    </w:rPr>
+  </w:style>
+  <w:style w:type="paragraph" w:styleId="5">
+    <w:name w:val="Normal (Web)"/>
+    <w:uiPriority w:val="0"/>
+    <w:pPr>
+      <w:spacing w:before="0" w:beforeAutospacing="1" w:after="0" w:afterAutospacing="1"/>
+      <w:ind w:left="0" w:right="0"/>
+      <w:jc w:val="left"/>
+    </w:pPr>
+    <w:rPr>
+      <w:kern w:val="0"/>
+      <w:sz w:val="24"/>
+      <w:szCs w:val="24"/>
+      <w:lang w:val="en-US" w:eastAsia="zh-CN" w:bidi="ar"/>
+    </w:rPr>
   </w:style>
 </w:styles>
 </file>

</xml_diff>